<commit_message>
refactor: align terminology with PacketScope cybersecurity domain and clean dashboard labels
</commit_message>
<xml_diff>
--- a/docs/PacketScope_Project_Report.docx
+++ b/docs/PacketScope_Project_Report.docx
@@ -424,12 +424,12 @@
     </w:p>
     <w:p>
       <w:r>
-        <w:t>• Condition Overview: Risk Index card, frame metrics, throughput, Telemetry Trend area chart, and Diagnostic Domains doughnut chart.</w:t>
+        <w:t>• Network Traffic Overview: Risk Score card, packet metrics, throughput volume, Traffic Over Time area chart, and Protocol Distribution doughnut chart.</w:t>
       </w:r>
     </w:p>
     <w:p>
       <w:r>
-        <w:t>• Anomalies &amp; Evidence: Filterable alert cards with forensic evidence JSON drawers and mitigation recommendations.</w:t>
+        <w:t>• Security Alerts &amp; Anomalies: Filterable alert cards with forensic evidence JSON drawers and defensive mitigation recommendations.</w:t>
       </w:r>
     </w:p>
     <w:p>

</xml_diff>